<commit_message>
Phụ lục định hướng: minh họa theo 2 dự án (dự án nghiên cứu, bộ minh họa)
- Thêm mục III. Dự án minh họa: Dự án 1 – dự án nghiên cứu ăn mòn khí quyển
  (387 số đo thật); Dự án 2 – bộ minh họa của bài trình bày (3 nguồn công bố,
  dữ liệu giả lập cài sẵn lỗi, công cụ cho máy không Internet); slide sử dụng
- Gắn từng minh họa ở Phần II–V với dự án tương ứng, kèm kết quả chính
- Đánh số lại mục IV–VI; công tác chuẩn bị: chạy lại 2 dự án minh họa

Co-Authored-By: Claude Opus 5.5 <noreply@anthropic.com>
Claude-Session: https://claude.ai/code/session_01GnZXc8ffTcYAj23tD34VwM
</commit_message>
<xml_diff>
--- a/thuyet-trinh/ke-hoach-hoi-thao/PHU-LUC-DINH-HUONG-TRINH-BAY.docx
+++ b/thuyet-trinh/ke-hoach-hoi-thao/PHU-LUC-DINH-HUONG-TRINH-BAY.docx
@@ -158,7 +158,7 @@
           <w:sz w:val="26"/>
           <w:szCs w:val="26"/>
         </w:rPr>
-        <w:t xml:space="preserve">Minh họa ứng dụng AI Agent trong toàn bộ chu trình thực hiện nhiệm vụ khoa học và công nghệ, từ tìm kiếm tài liệu đến công bố kết quả, trên một ví dụ gắn với lĩnh vực của Trung tâm (ăn mòn khí quyển của kim loại trong khí hậu nhiệt đới).</w:t>
+        <w:t xml:space="preserve">Minh họa ứng dụng AI Agent trong toàn bộ chu trình thực hiện nhiệm vụ khoa học và công nghệ, từ tìm kiếm tài liệu đến công bố kết quả, trên hai dự án minh họa gắn với lĩnh vực của Trung tâm: dự án nghiên cứu về ăn mòn khí quyển của kim loại trong khí hậu nhiệt đới và bộ minh họa đi kèm bài trình bày (mục III).</w:t>
       </w:r>
     </w:p>
     <w:p>
@@ -235,7 +235,7 @@
           <w:sz w:val="26"/>
           <w:szCs w:val="26"/>
         </w:rPr>
-        <w:t xml:space="preserve">Nội dung chính xác, có căn cứ; ví dụ minh họa dùng dữ liệu thật đã công bố; ngôn ngữ dễ hiểu với người nghe không chuyên về công nghệ thông tin.</w:t>
+        <w:t xml:space="preserve">Nội dung chính xác, có căn cứ; ví dụ minh họa dùng dữ liệu thật đã công bố; phần cần cài sẵn lỗi hoặc thay cho dữ liệu mật dùng dữ liệu giả lập, ghi rõ trên slide; ngôn ngữ dễ hiểu với người nghe không chuyên về công nghệ thông tin.</w:t>
       </w:r>
     </w:p>
     <w:p>
@@ -1437,7 +1437,582 @@
           <w:sz w:val="26"/>
           <w:szCs w:val="26"/>
         </w:rPr>
-        <w:t xml:space="preserve">III. ĐỊNH HƯỚNG NỘI DUNG TỪNG PHẦN</w:t>
+        <w:t xml:space="preserve">III. DỰ ÁN MINH HỌA</w:t>
+      </w:r>
+    </w:p>
+    <w:p>
+      <w:pPr>
+        <w:spacing w:after="60" w:before="60" w:line="300"/>
+        <w:ind w:firstLine="567"/>
+        <w:jc w:val="both"/>
+      </w:pPr>
+      <w:r>
+        <w:rPr>
+          <w:rFonts w:ascii="Times New Roman" w:cs="Times New Roman" w:eastAsia="Times New Roman" w:hAnsi="Times New Roman"/>
+          <w:sz w:val="26"/>
+          <w:szCs w:val="26"/>
+        </w:rPr>
+        <w:t xml:space="preserve">Các phần minh họa của bài trình bày được thực hiện trên hai dự án đã xây dựng hoàn chỉnh với sự hỗ trợ của AI Agent; toàn bộ kết quả chạy lại được bằng một lệnh.</w:t>
+      </w:r>
+    </w:p>
+    <w:tbl>
+      <w:tblPr>
+        <w:tblW w:type="dxa" w:w="9071"/>
+        <w:tblBorders>
+          <w:top w:val="single" w:color="auto" w:sz="4"/>
+          <w:left w:val="single" w:color="auto" w:sz="4"/>
+          <w:bottom w:val="single" w:color="auto" w:sz="4"/>
+          <w:right w:val="single" w:color="auto" w:sz="4"/>
+          <w:insideH w:val="single" w:color="auto" w:sz="4"/>
+          <w:insideV w:val="single" w:color="auto" w:sz="4"/>
+        </w:tblBorders>
+      </w:tblPr>
+      <w:tblGrid>
+        <w:gridCol w:w="520"/>
+        <w:gridCol w:w="2000"/>
+        <w:gridCol w:w="3851"/>
+        <w:gridCol w:w="1500"/>
+        <w:gridCol w:w="1200"/>
+      </w:tblGrid>
+      <w:tr>
+        <w:trPr>
+          <w:tblHeader/>
+        </w:trPr>
+        <w:tc>
+          <w:tcPr>
+            <w:tcW w:type="dxa" w:w="520"/>
+            <w:tcBorders>
+              <w:top w:val="single" w:color="000000" w:sz="4"/>
+              <w:left w:val="single" w:color="000000" w:sz="4"/>
+              <w:bottom w:val="single" w:color="000000" w:sz="4"/>
+              <w:right w:val="single" w:color="000000" w:sz="4"/>
+            </w:tcBorders>
+            <w:shd w:fill="E7E6E6" w:color="auto" w:val="clear"/>
+            <w:tcMar>
+              <w:top w:type="dxa" w:w="40"/>
+              <w:left w:type="dxa" w:w="80"/>
+              <w:bottom w:type="dxa" w:w="40"/>
+              <w:right w:type="dxa" w:w="80"/>
+            </w:tcMar>
+            <w:vAlign w:val="center"/>
+          </w:tcPr>
+          <w:p>
+            <w:pPr>
+              <w:spacing w:after="0" w:before="0" w:line="264"/>
+              <w:jc w:val="center"/>
+            </w:pPr>
+            <w:r>
+              <w:rPr>
+                <w:rFonts w:ascii="Times New Roman" w:cs="Times New Roman" w:eastAsia="Times New Roman" w:hAnsi="Times New Roman"/>
+                <w:b/>
+                <w:bCs/>
+                <w:sz w:val="24"/>
+                <w:szCs w:val="24"/>
+              </w:rPr>
+              <w:t xml:space="preserve">TT</w:t>
+            </w:r>
+          </w:p>
+        </w:tc>
+        <w:tc>
+          <w:tcPr>
+            <w:tcW w:type="dxa" w:w="2000"/>
+            <w:tcBorders>
+              <w:top w:val="single" w:color="000000" w:sz="4"/>
+              <w:left w:val="single" w:color="000000" w:sz="4"/>
+              <w:bottom w:val="single" w:color="000000" w:sz="4"/>
+              <w:right w:val="single" w:color="000000" w:sz="4"/>
+            </w:tcBorders>
+            <w:shd w:fill="E7E6E6" w:color="auto" w:val="clear"/>
+            <w:tcMar>
+              <w:top w:type="dxa" w:w="40"/>
+              <w:left w:type="dxa" w:w="80"/>
+              <w:bottom w:type="dxa" w:w="40"/>
+              <w:right w:type="dxa" w:w="80"/>
+            </w:tcMar>
+            <w:vAlign w:val="center"/>
+          </w:tcPr>
+          <w:p>
+            <w:pPr>
+              <w:spacing w:after="0" w:before="0" w:line="264"/>
+              <w:jc w:val="center"/>
+            </w:pPr>
+            <w:r>
+              <w:rPr>
+                <w:rFonts w:ascii="Times New Roman" w:cs="Times New Roman" w:eastAsia="Times New Roman" w:hAnsi="Times New Roman"/>
+                <w:b/>
+                <w:bCs/>
+                <w:sz w:val="24"/>
+                <w:szCs w:val="24"/>
+              </w:rPr>
+              <w:t xml:space="preserve">Dự án</w:t>
+            </w:r>
+          </w:p>
+        </w:tc>
+        <w:tc>
+          <w:tcPr>
+            <w:tcW w:type="dxa" w:w="3851"/>
+            <w:tcBorders>
+              <w:top w:val="single" w:color="000000" w:sz="4"/>
+              <w:left w:val="single" w:color="000000" w:sz="4"/>
+              <w:bottom w:val="single" w:color="000000" w:sz="4"/>
+              <w:right w:val="single" w:color="000000" w:sz="4"/>
+            </w:tcBorders>
+            <w:shd w:fill="E7E6E6" w:color="auto" w:val="clear"/>
+            <w:tcMar>
+              <w:top w:type="dxa" w:w="40"/>
+              <w:left w:type="dxa" w:w="80"/>
+              <w:bottom w:type="dxa" w:w="40"/>
+              <w:right w:type="dxa" w:w="80"/>
+            </w:tcMar>
+            <w:vAlign w:val="center"/>
+          </w:tcPr>
+          <w:p>
+            <w:pPr>
+              <w:spacing w:after="0" w:before="0" w:line="264"/>
+              <w:jc w:val="center"/>
+            </w:pPr>
+            <w:r>
+              <w:rPr>
+                <w:rFonts w:ascii="Times New Roman" w:cs="Times New Roman" w:eastAsia="Times New Roman" w:hAnsi="Times New Roman"/>
+                <w:b/>
+                <w:bCs/>
+                <w:sz w:val="24"/>
+                <w:szCs w:val="24"/>
+              </w:rPr>
+              <w:t xml:space="preserve">Nội dung chính</w:t>
+            </w:r>
+          </w:p>
+        </w:tc>
+        <w:tc>
+          <w:tcPr>
+            <w:tcW w:type="dxa" w:w="1500"/>
+            <w:tcBorders>
+              <w:top w:val="single" w:color="000000" w:sz="4"/>
+              <w:left w:val="single" w:color="000000" w:sz="4"/>
+              <w:bottom w:val="single" w:color="000000" w:sz="4"/>
+              <w:right w:val="single" w:color="000000" w:sz="4"/>
+            </w:tcBorders>
+            <w:shd w:fill="E7E6E6" w:color="auto" w:val="clear"/>
+            <w:tcMar>
+              <w:top w:type="dxa" w:w="40"/>
+              <w:left w:type="dxa" w:w="80"/>
+              <w:bottom w:type="dxa" w:w="40"/>
+              <w:right w:type="dxa" w:w="80"/>
+            </w:tcMar>
+            <w:vAlign w:val="center"/>
+          </w:tcPr>
+          <w:p>
+            <w:pPr>
+              <w:spacing w:after="0" w:before="0" w:line="264"/>
+              <w:jc w:val="center"/>
+            </w:pPr>
+            <w:r>
+              <w:rPr>
+                <w:rFonts w:ascii="Times New Roman" w:cs="Times New Roman" w:eastAsia="Times New Roman" w:hAnsi="Times New Roman"/>
+                <w:b/>
+                <w:bCs/>
+                <w:sz w:val="24"/>
+                <w:szCs w:val="24"/>
+              </w:rPr>
+              <w:t xml:space="preserve">Dữ liệu</w:t>
+            </w:r>
+          </w:p>
+        </w:tc>
+        <w:tc>
+          <w:tcPr>
+            <w:tcW w:type="dxa" w:w="1200"/>
+            <w:tcBorders>
+              <w:top w:val="single" w:color="000000" w:sz="4"/>
+              <w:left w:val="single" w:color="000000" w:sz="4"/>
+              <w:bottom w:val="single" w:color="000000" w:sz="4"/>
+              <w:right w:val="single" w:color="000000" w:sz="4"/>
+            </w:tcBorders>
+            <w:shd w:fill="E7E6E6" w:color="auto" w:val="clear"/>
+            <w:tcMar>
+              <w:top w:type="dxa" w:w="40"/>
+              <w:left w:type="dxa" w:w="80"/>
+              <w:bottom w:type="dxa" w:w="40"/>
+              <w:right w:type="dxa" w:w="80"/>
+            </w:tcMar>
+            <w:vAlign w:val="center"/>
+          </w:tcPr>
+          <w:p>
+            <w:pPr>
+              <w:spacing w:after="0" w:before="0" w:line="264"/>
+              <w:jc w:val="center"/>
+            </w:pPr>
+            <w:r>
+              <w:rPr>
+                <w:rFonts w:ascii="Times New Roman" w:cs="Times New Roman" w:eastAsia="Times New Roman" w:hAnsi="Times New Roman"/>
+                <w:b/>
+                <w:bCs/>
+                <w:sz w:val="24"/>
+                <w:szCs w:val="24"/>
+              </w:rPr>
+              <w:t xml:space="preserve">Sử dụng tại slide</w:t>
+            </w:r>
+          </w:p>
+        </w:tc>
+      </w:tr>
+      <w:tr>
+        <w:trPr>
+          <w:tblHeader w:val="false"/>
+        </w:trPr>
+        <w:tc>
+          <w:tcPr>
+            <w:tcW w:type="dxa" w:w="520"/>
+            <w:tcBorders>
+              <w:top w:val="single" w:color="000000" w:sz="4"/>
+              <w:left w:val="single" w:color="000000" w:sz="4"/>
+              <w:bottom w:val="single" w:color="000000" w:sz="4"/>
+              <w:right w:val="single" w:color="000000" w:sz="4"/>
+            </w:tcBorders>
+            <w:tcMar>
+              <w:top w:type="dxa" w:w="40"/>
+              <w:left w:type="dxa" w:w="80"/>
+              <w:bottom w:type="dxa" w:w="40"/>
+              <w:right w:type="dxa" w:w="80"/>
+            </w:tcMar>
+            <w:vAlign w:val="center"/>
+          </w:tcPr>
+          <w:p>
+            <w:pPr>
+              <w:spacing w:after="0" w:before="0" w:line="264"/>
+              <w:jc w:val="center"/>
+            </w:pPr>
+            <w:r>
+              <w:rPr>
+                <w:rFonts w:ascii="Times New Roman" w:cs="Times New Roman" w:eastAsia="Times New Roman" w:hAnsi="Times New Roman"/>
+                <w:sz w:val="24"/>
+                <w:szCs w:val="24"/>
+              </w:rPr>
+              <w:t xml:space="preserve">1</w:t>
+            </w:r>
+          </w:p>
+        </w:tc>
+        <w:tc>
+          <w:tcPr>
+            <w:tcW w:type="dxa" w:w="2000"/>
+            <w:tcBorders>
+              <w:top w:val="single" w:color="000000" w:sz="4"/>
+              <w:left w:val="single" w:color="000000" w:sz="4"/>
+              <w:bottom w:val="single" w:color="000000" w:sz="4"/>
+              <w:right w:val="single" w:color="000000" w:sz="4"/>
+            </w:tcBorders>
+            <w:tcMar>
+              <w:top w:type="dxa" w:w="40"/>
+              <w:left w:type="dxa" w:w="80"/>
+              <w:bottom w:type="dxa" w:w="40"/>
+              <w:right w:type="dxa" w:w="80"/>
+            </w:tcMar>
+            <w:vAlign w:val="center"/>
+          </w:tcPr>
+          <w:p>
+            <w:pPr>
+              <w:spacing w:after="0" w:before="0" w:line="264"/>
+              <w:jc w:val="left"/>
+            </w:pPr>
+            <w:r>
+              <w:rPr>
+                <w:rFonts w:ascii="Times New Roman" w:cs="Times New Roman" w:eastAsia="Times New Roman" w:hAnsi="Times New Roman"/>
+                <w:b w:val="false"/>
+                <w:bCs w:val="false"/>
+                <w:sz w:val="24"/>
+                <w:szCs w:val="24"/>
+              </w:rPr>
+              <w:t xml:space="preserve">Dự án nghiên cứu “Khả năng áp dụng mô hình ăn mòn khí quyển quốc tế cho khí hậu nhiệt đới Việt Nam”</w:t>
+            </w:r>
+          </w:p>
+        </w:tc>
+        <w:tc>
+          <w:tcPr>
+            <w:tcW w:type="dxa" w:w="3851"/>
+            <w:tcBorders>
+              <w:top w:val="single" w:color="000000" w:sz="4"/>
+              <w:left w:val="single" w:color="000000" w:sz="4"/>
+              <w:bottom w:val="single" w:color="000000" w:sz="4"/>
+              <w:right w:val="single" w:color="000000" w:sz="4"/>
+            </w:tcBorders>
+            <w:tcMar>
+              <w:top w:type="dxa" w:w="40"/>
+              <w:left w:type="dxa" w:w="80"/>
+              <w:bottom w:type="dxa" w:w="40"/>
+              <w:right w:type="dxa" w:w="80"/>
+            </w:tcMar>
+            <w:vAlign w:val="center"/>
+          </w:tcPr>
+          <w:p>
+            <w:pPr>
+              <w:spacing w:after="0" w:before="0" w:line="264"/>
+              <w:jc w:val="left"/>
+            </w:pPr>
+            <w:r>
+              <w:rPr>
+                <w:rFonts w:ascii="Times New Roman" w:cs="Times New Roman" w:eastAsia="Times New Roman" w:hAnsi="Times New Roman"/>
+                <w:b w:val="false"/>
+                <w:bCs w:val="false"/>
+                <w:sz w:val="24"/>
+                <w:szCs w:val="24"/>
+              </w:rPr>
+              <w:t xml:space="preserve">Thực hiện đủ vòng đời một nhiệm vụ: tổng quan tài liệu (13 tài liệu đã xác minh, ma trận bằng chứng, 3 khoảng trống) → bản nháp đề xuất → hợp nhất, kiểm tra dữ liệu → mô hình, hiệu chỉnh theo vùng → mô hình 3D → bản thảo bài báo → báo cáo tổng hợp; có nhật ký thực hiện, ghi cả các lần sai và sửa</w:t>
+            </w:r>
+          </w:p>
+        </w:tc>
+        <w:tc>
+          <w:tcPr>
+            <w:tcW w:type="dxa" w:w="1500"/>
+            <w:tcBorders>
+              <w:top w:val="single" w:color="000000" w:sz="4"/>
+              <w:left w:val="single" w:color="000000" w:sz="4"/>
+              <w:bottom w:val="single" w:color="000000" w:sz="4"/>
+              <w:right w:val="single" w:color="000000" w:sz="4"/>
+            </w:tcBorders>
+            <w:tcMar>
+              <w:top w:type="dxa" w:w="40"/>
+              <w:left w:type="dxa" w:w="80"/>
+              <w:bottom w:type="dxa" w:w="40"/>
+              <w:right w:type="dxa" w:w="80"/>
+            </w:tcMar>
+            <w:vAlign w:val="center"/>
+          </w:tcPr>
+          <w:p>
+            <w:pPr>
+              <w:spacing w:after="0" w:before="0" w:line="264"/>
+              <w:jc w:val="left"/>
+            </w:pPr>
+            <w:r>
+              <w:rPr>
+                <w:rFonts w:ascii="Times New Roman" w:cs="Times New Roman" w:eastAsia="Times New Roman" w:hAnsi="Times New Roman"/>
+                <w:b w:val="false"/>
+                <w:bCs w:val="false"/>
+                <w:sz w:val="24"/>
+                <w:szCs w:val="24"/>
+              </w:rPr>
+              <w:t xml:space="preserve">Thật, đã công bố: 387 số đo thực địa (kho dữ liệu mở C-OLR, giấy phép MIT)</w:t>
+            </w:r>
+          </w:p>
+        </w:tc>
+        <w:tc>
+          <w:tcPr>
+            <w:tcW w:type="dxa" w:w="1200"/>
+            <w:tcBorders>
+              <w:top w:val="single" w:color="000000" w:sz="4"/>
+              <w:left w:val="single" w:color="000000" w:sz="4"/>
+              <w:bottom w:val="single" w:color="000000" w:sz="4"/>
+              <w:right w:val="single" w:color="000000" w:sz="4"/>
+            </w:tcBorders>
+            <w:tcMar>
+              <w:top w:type="dxa" w:w="40"/>
+              <w:left w:type="dxa" w:w="80"/>
+              <w:bottom w:type="dxa" w:w="40"/>
+              <w:right w:type="dxa" w:w="80"/>
+            </w:tcMar>
+            <w:vAlign w:val="center"/>
+          </w:tcPr>
+          <w:p>
+            <w:pPr>
+              <w:spacing w:after="0" w:before="0" w:line="264"/>
+              <w:jc w:val="center"/>
+            </w:pPr>
+            <w:r>
+              <w:rPr>
+                <w:rFonts w:ascii="Times New Roman" w:cs="Times New Roman" w:eastAsia="Times New Roman" w:hAnsi="Times New Roman"/>
+                <w:sz w:val="24"/>
+                <w:szCs w:val="24"/>
+              </w:rPr>
+              <w:t xml:space="preserve">9, 10, 12 – 19, 24, 25</w:t>
+            </w:r>
+          </w:p>
+        </w:tc>
+      </w:tr>
+      <w:tr>
+        <w:trPr>
+          <w:tblHeader w:val="false"/>
+        </w:trPr>
+        <w:tc>
+          <w:tcPr>
+            <w:tcW w:type="dxa" w:w="520"/>
+            <w:tcBorders>
+              <w:top w:val="single" w:color="000000" w:sz="4"/>
+              <w:left w:val="single" w:color="000000" w:sz="4"/>
+              <w:bottom w:val="single" w:color="000000" w:sz="4"/>
+              <w:right w:val="single" w:color="000000" w:sz="4"/>
+            </w:tcBorders>
+            <w:tcMar>
+              <w:top w:type="dxa" w:w="40"/>
+              <w:left w:type="dxa" w:w="80"/>
+              <w:bottom w:type="dxa" w:w="40"/>
+              <w:right w:type="dxa" w:w="80"/>
+            </w:tcMar>
+            <w:vAlign w:val="center"/>
+          </w:tcPr>
+          <w:p>
+            <w:pPr>
+              <w:spacing w:after="0" w:before="0" w:line="264"/>
+              <w:jc w:val="center"/>
+            </w:pPr>
+            <w:r>
+              <w:rPr>
+                <w:rFonts w:ascii="Times New Roman" w:cs="Times New Roman" w:eastAsia="Times New Roman" w:hAnsi="Times New Roman"/>
+                <w:sz w:val="24"/>
+                <w:szCs w:val="24"/>
+              </w:rPr>
+              <w:t xml:space="preserve">2</w:t>
+            </w:r>
+          </w:p>
+        </w:tc>
+        <w:tc>
+          <w:tcPr>
+            <w:tcW w:type="dxa" w:w="2000"/>
+            <w:tcBorders>
+              <w:top w:val="single" w:color="000000" w:sz="4"/>
+              <w:left w:val="single" w:color="000000" w:sz="4"/>
+              <w:bottom w:val="single" w:color="000000" w:sz="4"/>
+              <w:right w:val="single" w:color="000000" w:sz="4"/>
+            </w:tcBorders>
+            <w:tcMar>
+              <w:top w:type="dxa" w:w="40"/>
+              <w:left w:type="dxa" w:w="80"/>
+              <w:bottom w:type="dxa" w:w="40"/>
+              <w:right w:type="dxa" w:w="80"/>
+            </w:tcMar>
+            <w:vAlign w:val="center"/>
+          </w:tcPr>
+          <w:p>
+            <w:pPr>
+              <w:spacing w:after="0" w:before="0" w:line="264"/>
+              <w:jc w:val="left"/>
+            </w:pPr>
+            <w:r>
+              <w:rPr>
+                <w:rFonts w:ascii="Times New Roman" w:cs="Times New Roman" w:eastAsia="Times New Roman" w:hAnsi="Times New Roman"/>
+                <w:b w:val="false"/>
+                <w:bCs w:val="false"/>
+                <w:sz w:val="24"/>
+                <w:szCs w:val="24"/>
+              </w:rPr>
+              <w:t xml:space="preserve">Bộ minh họa của bài trình bày</w:t>
+            </w:r>
+          </w:p>
+        </w:tc>
+        <w:tc>
+          <w:tcPr>
+            <w:tcW w:type="dxa" w:w="3851"/>
+            <w:tcBorders>
+              <w:top w:val="single" w:color="000000" w:sz="4"/>
+              <w:left w:val="single" w:color="000000" w:sz="4"/>
+              <w:bottom w:val="single" w:color="000000" w:sz="4"/>
+              <w:right w:val="single" w:color="000000" w:sz="4"/>
+            </w:tcBorders>
+            <w:tcMar>
+              <w:top w:type="dxa" w:w="40"/>
+              <w:left w:type="dxa" w:w="80"/>
+              <w:bottom w:type="dxa" w:w="40"/>
+              <w:right w:type="dxa" w:w="80"/>
+            </w:tcMar>
+            <w:vAlign w:val="center"/>
+          </w:tcPr>
+          <w:p>
+            <w:pPr>
+              <w:spacing w:after="0" w:before="0" w:line="264"/>
+              <w:jc w:val="left"/>
+            </w:pPr>
+            <w:r>
+              <w:rPr>
+                <w:rFonts w:ascii="Times New Roman" w:cs="Times New Roman" w:eastAsia="Times New Roman" w:hAnsi="Times New Roman"/>
+                <w:b w:val="false"/>
+                <w:bCs w:val="false"/>
+                <w:sz w:val="24"/>
+                <w:szCs w:val="24"/>
+              </w:rPr>
+              <w:t xml:space="preserve">Tổng hợp dữ liệu từ 3 nguồn công bố, 4 định dạng; bộ dữ liệu ăn mòn, khí tượng và kế hoạch công việc có cài sẵn lỗi để AI phát hiện; công cụ ước lượng lộ trình thiết bị bay không người lái chạy trên máy không kết nối Internet</w:t>
+            </w:r>
+          </w:p>
+        </w:tc>
+        <w:tc>
+          <w:tcPr>
+            <w:tcW w:type="dxa" w:w="1500"/>
+            <w:tcBorders>
+              <w:top w:val="single" w:color="000000" w:sz="4"/>
+              <w:left w:val="single" w:color="000000" w:sz="4"/>
+              <w:bottom w:val="single" w:color="000000" w:sz="4"/>
+              <w:right w:val="single" w:color="000000" w:sz="4"/>
+            </w:tcBorders>
+            <w:tcMar>
+              <w:top w:type="dxa" w:w="40"/>
+              <w:left w:type="dxa" w:w="80"/>
+              <w:bottom w:type="dxa" w:w="40"/>
+              <w:right w:type="dxa" w:w="80"/>
+            </w:tcMar>
+            <w:vAlign w:val="center"/>
+          </w:tcPr>
+          <w:p>
+            <w:pPr>
+              <w:spacing w:after="0" w:before="0" w:line="264"/>
+              <w:jc w:val="left"/>
+            </w:pPr>
+            <w:r>
+              <w:rPr>
+                <w:rFonts w:ascii="Times New Roman" w:cs="Times New Roman" w:eastAsia="Times New Roman" w:hAnsi="Times New Roman"/>
+                <w:b w:val="false"/>
+                <w:bCs w:val="false"/>
+                <w:sz w:val="24"/>
+                <w:szCs w:val="24"/>
+              </w:rPr>
+              <w:t xml:space="preserve">Thật (trích từ C-OLR) và giả lập</w:t>
+            </w:r>
+          </w:p>
+        </w:tc>
+        <w:tc>
+          <w:tcPr>
+            <w:tcW w:type="dxa" w:w="1200"/>
+            <w:tcBorders>
+              <w:top w:val="single" w:color="000000" w:sz="4"/>
+              <w:left w:val="single" w:color="000000" w:sz="4"/>
+              <w:bottom w:val="single" w:color="000000" w:sz="4"/>
+              <w:right w:val="single" w:color="000000" w:sz="4"/>
+            </w:tcBorders>
+            <w:tcMar>
+              <w:top w:type="dxa" w:w="40"/>
+              <w:left w:type="dxa" w:w="80"/>
+              <w:bottom w:type="dxa" w:w="40"/>
+              <w:right w:type="dxa" w:w="80"/>
+            </w:tcMar>
+            <w:vAlign w:val="center"/>
+          </w:tcPr>
+          <w:p>
+            <w:pPr>
+              <w:spacing w:after="0" w:before="0" w:line="264"/>
+              <w:jc w:val="center"/>
+            </w:pPr>
+            <w:r>
+              <w:rPr>
+                <w:rFonts w:ascii="Times New Roman" w:cs="Times New Roman" w:eastAsia="Times New Roman" w:hAnsi="Times New Roman"/>
+                <w:sz w:val="24"/>
+                <w:szCs w:val="24"/>
+              </w:rPr>
+              <w:t xml:space="preserve">8, 14, 16, 22</w:t>
+            </w:r>
+          </w:p>
+        </w:tc>
+      </w:tr>
+    </w:tbl>
+    <w:p>
+      <w:pPr>
+        <w:keepNext/>
+        <w:spacing w:after="60" w:before="180" w:line="300"/>
+        <w:ind w:firstLine="567"/>
+        <w:jc w:val="both"/>
+      </w:pPr>
+      <w:r>
+        <w:rPr>
+          <w:rFonts w:ascii="Times New Roman" w:cs="Times New Roman" w:eastAsia="Times New Roman" w:hAnsi="Times New Roman"/>
+          <w:b/>
+          <w:bCs/>
+          <w:sz w:val="26"/>
+          <w:szCs w:val="26"/>
+        </w:rPr>
+        <w:t xml:space="preserve">IV. ĐỊNH HƯỚNG NỘI DUNG TỪNG PHẦN</w:t>
       </w:r>
     </w:p>
     <w:p>
@@ -1660,7 +2235,7 @@
           <w:sz w:val="26"/>
           <w:szCs w:val="26"/>
         </w:rPr>
-        <w:t xml:space="preserve">Giới thiệu Claude trên Windows: các mô hình, năm tính năng dùng ngay (dự án, tạo tệp – chạy mã, nghiên cứu chuyên sâu, Cowork, tác vụ theo lịch); sáu bước bắt đầu sử dụng; minh họa tổng hợp dữ liệu từ 3 nguồn công bố.</w:t>
+        <w:t xml:space="preserve">Giới thiệu Claude trên Windows: các mô hình, năm tính năng dùng ngay (dự án, tạo tệp – chạy mã, nghiên cứu chuyên sâu, Cowork, tác vụ theo lịch); sáu bước bắt đầu sử dụng; minh họa tổng hợp dữ liệu từ 3 nguồn công bố (Dự án 2): 4 tệp khác định dạng → bảng tổng hợp, báo cáo Word; AI phát hiện nhãn đơn vị sai trong nguồn.</w:t>
       </w:r>
     </w:p>
     <w:p>
@@ -1679,7 +2254,7 @@
           <w:sz w:val="26"/>
           <w:szCs w:val="26"/>
         </w:rPr>
-        <w:t xml:space="preserve">Phương pháp giao việc cho AI Agent theo 5 bước (nhiệm vụ – dữ liệu – đầu ra – dẫn nguồn, lưu mã – kiểm tra).</w:t>
+        <w:t xml:space="preserve">Phương pháp giao việc cho AI Agent theo 5 bước (nhiệm vụ – dữ liệu – đầu ra – dẫn nguồn, lưu mã – kiểm tra); ví dụ câu lệnh đủ 5 bước trên dữ liệu thật của Dự án 1.</w:t>
       </w:r>
     </w:p>
     <w:p>
@@ -1698,7 +2273,7 @@
           <w:sz w:val="26"/>
           <w:szCs w:val="26"/>
         </w:rPr>
-        <w:t xml:space="preserve">Tổ chức không gian làm việc theo từng nhiệm vụ; giới thiệu Skill, Subagent và hệ thống nhiều Agent.</w:t>
+        <w:t xml:space="preserve">Tổ chức không gian làm việc theo từng nhiệm vụ, lấy cấu trúc Dự án 1 làm mẫu (mỗi giai đoạn của nhiệm vụ một thư mục, từ quản lý dự án, tài liệu đến bài báo, báo cáo); giới thiệu Skill, Subagent và hệ thống nhiều Agent.</w:t>
       </w:r>
     </w:p>
     <w:p>
@@ -1743,7 +2318,7 @@
           <w:sz w:val="26"/>
           <w:szCs w:val="26"/>
         </w:rPr>
-        <w:t xml:space="preserve">minh họa AI hỗ trợ từng công đoạn của một nhiệm vụ khoa học và công nghệ, trên ví dụ “Khả năng áp dụng mô hình ăn mòn khí quyển quốc tế cho khí hậu nhiệt đới Việt Nam” (387 số đo thực địa đã công bố).</w:t>
+        <w:t xml:space="preserve">minh họa AI hỗ trợ từng công đoạn của một nhiệm vụ khoa học và công nghệ, theo đúng trình tự các giai đoạn của Dự án 1; phần minh họa phát hiện lỗi dùng dữ liệu giả lập của Dự án 2.</w:t>
       </w:r>
     </w:p>
     <w:p>
@@ -1762,7 +2337,7 @@
           <w:sz w:val="26"/>
           <w:szCs w:val="26"/>
         </w:rPr>
-        <w:t xml:space="preserve">Nghiên cứu tài liệu và tổng quan: tìm bài ứng viên bằng Sci-Bot – trợ lý AI trên kho Sci-Hub (câu trả lời tổng hợp kèm danh sách bài báo, DOI), bổ sung bài mới bằng Google Scholar Labs, Semantic Scholar; lọc theo tiêu đề, tóm tắt (Elicit, Consensus, Claude); lấy toàn văn theo DOI qua Sci-Hub, Unpaywall, CORE và nguồn tiếng Việt – tiếng Nga (VJOL, CyberLeninka, eLIBRARY.ru); lập ma trận bằng chứng, xác định 3 khoảng trống nghiên cứu; kiểm tra DOI của mọi trích dẫn.</w:t>
+        <w:t xml:space="preserve">Nghiên cứu tài liệu và tổng quan: tìm bài ứng viên bằng Sci-Bot – trợ lý AI trên kho Sci-Hub (câu trả lời tổng hợp kèm danh sách bài báo, DOI), bổ sung bài mới bằng Google Scholar Labs, Semantic Scholar; lọc theo tiêu đề, tóm tắt (Elicit, Consensus, Claude); lấy toàn văn theo DOI qua Sci-Hub, Unpaywall, CORE và nguồn tiếng Việt – tiếng Nga (VJOL, CyberLeninka, eLIBRARY.ru); lập ma trận bằng chứng từ 13 tài liệu đã xác minh, xác định 3 khoảng trống nghiên cứu (Dự án 1); kiểm tra DOI của mọi trích dẫn.</w:t>
       </w:r>
     </w:p>
     <w:p>
@@ -1781,7 +2356,7 @@
           <w:sz w:val="26"/>
           <w:szCs w:val="26"/>
         </w:rPr>
-        <w:t xml:space="preserve">Xây dựng thuyết minh đề tài từ khoảng trống đã chọn (minh họa 1): phiếu đề xuất, thuyết minh theo biểu mẫu của Trung tâm; tiến độ, dự toán theo Thông tư 03/2023/TT-BTC và quy định của Bộ Quốc phòng.</w:t>
+        <w:t xml:space="preserve">Xây dựng thuyết minh đề tài từ khoảng trống thứ nhất của Dự án 1 (minh họa 1): phiếu đề xuất, thuyết minh theo biểu mẫu của Trung tâm; tiến độ, dự toán theo Thông tư 03/2023/TT-BTC và quy định của Bộ Quốc phòng; với kế hoạch công việc giả lập (Dự án 2), AI phát hiện đủ 3 bất hợp lý cài sẵn về trình tự công việc.</w:t>
       </w:r>
     </w:p>
     <w:p>
@@ -1819,7 +2394,7 @@
           <w:sz w:val="26"/>
           <w:szCs w:val="26"/>
         </w:rPr>
-        <w:t xml:space="preserve">Minh họa 2 – áp dụng quy trình trên: AI viết và chạy mã Python xử lý dữ liệu, phát hiện lỗi đơn vị trong dữ liệu công bố; mô hình quốc tế dự đoán thấp hơn thực đo ở Việt Nam khoảng 31%; sau hiệu chỉnh theo vùng, xếp đúng cấp ăn mòn 9/12 trạm (trước là 2/12).</w:t>
+        <w:t xml:space="preserve">Minh họa 2 – áp dụng quy trình trên: AI viết và chạy mã Python xử lý dữ liệu. Với dữ liệu giả lập (Dự án 2): phát hiện đủ 14/14 lỗi cài sẵn. Với 387 số đo thật (Dự án 1): phát hiện lỗi đơn vị trong dữ liệu công bố; mô hình quốc tế dự đoán thấp hơn thực đo ở Việt Nam khoảng 31%; sau hiệu chỉnh theo vùng, xếp đúng cấp ăn mòn 9/12 trạm (trước là 2/12).</w:t>
       </w:r>
     </w:p>
     <w:p>
@@ -1838,7 +2413,7 @@
           <w:sz w:val="26"/>
           <w:szCs w:val="26"/>
         </w:rPr>
-        <w:t xml:space="preserve">Mô hình 3D mô phỏng quá trình ăn mòn thép tại Nha Trang trong 30 năm và so sánh thép – kẽm – đồng – nhôm.</w:t>
+        <w:t xml:space="preserve">Mô hình 3D tương tác (Dự án 1) mô phỏng quá trình ăn mòn thép tại Nha Trang trong 30 năm và so sánh thép – kẽm – đồng – nhôm.</w:t>
       </w:r>
     </w:p>
     <w:p>
@@ -1857,7 +2432,7 @@
           <w:sz w:val="26"/>
           <w:szCs w:val="26"/>
         </w:rPr>
-        <w:t xml:space="preserve">Công bố kết quả theo nhiều định dạng: tạp chí Scopus/Web of Science, danh mục ВАК (Nga), tạp chí trong nước, báo cáo của Trung tâm; nhà khoa học xác nhận ở mỗi bước.</w:t>
+        <w:t xml:space="preserve">Công bố kết quả: bản thảo bài báo (tóm tắt Việt – Anh) và báo cáo tổng hợp của Dự án 1; chuyển đổi theo nhiều định dạng: tạp chí Scopus/Web of Science, danh mục ВАК (Nga), tạp chí trong nước, báo cáo của Trung tâm; nhà khoa học xác nhận ở mỗi bước.</w:t>
       </w:r>
     </w:p>
     <w:p>
@@ -1959,7 +2534,7 @@
           <w:sz w:val="26"/>
           <w:szCs w:val="26"/>
         </w:rPr>
-        <w:t xml:space="preserve">Minh họa 3 (dữ liệu giả lập): công cụ ước lượng lộ trình thiết bị bay không người lái theo địa hình và khí hậu nhiệt đới.</w:t>
+        <w:t xml:space="preserve">Minh họa 3 (Dự án 2, dữ liệu giả lập thay cho dữ liệu mật): công cụ ước lượng lộ trình thiết bị bay không người lái theo địa hình và khí hậu nhiệt đới – lộ trình vòng tránh 8 ô cấm bay; chiều về ngược gió mùa tốn năng lượng gấp 1,8 lần chiều đi nên phải đổi phương án; quét mã không phát hiện kết nối mạng, mã băm trên máy đích khớp.</w:t>
       </w:r>
     </w:p>
     <w:p>
@@ -2042,7 +2617,7 @@
           <w:sz w:val="26"/>
           <w:szCs w:val="26"/>
         </w:rPr>
-        <w:t xml:space="preserve">Skill và thư viện Skill khoa học mở; kết quả thí nghiệm khi không dùng và có dùng Skill.</w:t>
+        <w:t xml:space="preserve">Skill và thư viện Skill khoa học mở; thí nghiệm trên 387 số đo của Dự án 1 khi không dùng và có dùng Skill: Skill bổ sung 3 bước kiểm tra mà phân tích ban đầu bỏ qua.</w:t>
       </w:r>
     </w:p>
     <w:p>
@@ -2061,7 +2636,7 @@
           <w:sz w:val="26"/>
           <w:szCs w:val="26"/>
         </w:rPr>
-        <w:t xml:space="preserve">Khoa học mở; ba mức tự động hóa (hỗ trợ từng bước – bán tự động – tự động toàn trình).</w:t>
+        <w:t xml:space="preserve">Khoa học mở qua vòng đời bộ dữ liệu của Dự án 1: dữ liệu công bố mở → tái sử dụng → phát hiện lỗi đơn vị → tri thức mới → đóng góp lại cộng đồng; ba mức tự động hóa (hỗ trợ từng bước – bán tự động – tự động toàn trình).</w:t>
       </w:r>
     </w:p>
     <w:p>
@@ -2143,7 +2718,7 @@
           <w:sz w:val="26"/>
           <w:szCs w:val="26"/>
         </w:rPr>
-        <w:t xml:space="preserve">IV. YÊU CẦU VỀ BẢO MẬT VÀ AN TOÀN THÔNG TIN</w:t>
+        <w:t xml:space="preserve">V. YÊU CẦU VỀ BẢO MẬT VÀ AN TOÀN THÔNG TIN</w:t>
       </w:r>
     </w:p>
     <w:p>
@@ -2218,7 +2793,7 @@
           <w:sz w:val="26"/>
           <w:szCs w:val="26"/>
         </w:rPr>
-        <w:t xml:space="preserve">V. CÔNG TÁC CHUẨN BỊ</w:t>
+        <w:t xml:space="preserve">VI. CÔNG TÁC CHUẨN BỊ</w:t>
       </w:r>
     </w:p>
     <w:tbl>
@@ -2486,7 +3061,7 @@
                 <w:sz w:val="24"/>
                 <w:szCs w:val="24"/>
               </w:rPr>
-              <w:t xml:space="preserve">Hoàn thiện bài trình bày; thực hiện trước và ghi hình các phần minh họa</w:t>
+              <w:t xml:space="preserve">Hoàn thiện bài trình bày; chạy lại 2 dự án minh họa, thực hiện trước và ghi hình các phần minh họa</w:t>
             </w:r>
           </w:p>
         </w:tc>
@@ -2588,7 +3163,7 @@
                 <w:sz w:val="24"/>
                 <w:szCs w:val="24"/>
               </w:rPr>
-              <w:t xml:space="preserve">Bộ slide, video, ảnh</w:t>
+              <w:t xml:space="preserve">Bộ slide, video, ảnh; kết quả 2 dự án</w:t>
             </w:r>
           </w:p>
         </w:tc>

</xml_diff>

<commit_message>
Phụ lục định hướng: minh họa theo 2 dự án (dự án nghiên cứu, bộ minh họa) (#14)
- Thêm mục III. Dự án minh họa: Dự án 1 – dự án nghiên cứu ăn mòn khí quyển
  (387 số đo thật); Dự án 2 – bộ minh họa của bài trình bày (3 nguồn công bố,
  dữ liệu giả lập cài sẵn lỗi, công cụ cho máy không Internet); slide sử dụng
- Gắn từng minh họa ở Phần II–V với dự án tương ứng, kèm kết quả chính
- Đánh số lại mục IV–VI; công tác chuẩn bị: chạy lại 2 dự án minh họa


Claude-Session: https://claude.ai/code/session_01GnZXc8ffTcYAj23tD34VwM

Co-authored-by: Claude <noreply@anthropic.com>
</commit_message>
<xml_diff>
--- a/thuyet-trinh/ke-hoach-hoi-thao/PHU-LUC-DINH-HUONG-TRINH-BAY.docx
+++ b/thuyet-trinh/ke-hoach-hoi-thao/PHU-LUC-DINH-HUONG-TRINH-BAY.docx
@@ -158,7 +158,7 @@
           <w:sz w:val="26"/>
           <w:szCs w:val="26"/>
         </w:rPr>
-        <w:t xml:space="preserve">Minh họa ứng dụng AI Agent trong toàn bộ chu trình thực hiện nhiệm vụ khoa học và công nghệ, từ tìm kiếm tài liệu đến công bố kết quả, trên một ví dụ gắn với lĩnh vực của Trung tâm (ăn mòn khí quyển của kim loại trong khí hậu nhiệt đới).</w:t>
+        <w:t xml:space="preserve">Minh họa ứng dụng AI Agent trong toàn bộ chu trình thực hiện nhiệm vụ khoa học và công nghệ, từ tìm kiếm tài liệu đến công bố kết quả, trên hai dự án minh họa gắn với lĩnh vực của Trung tâm: dự án nghiên cứu về ăn mòn khí quyển của kim loại trong khí hậu nhiệt đới và bộ minh họa đi kèm bài trình bày (mục III).</w:t>
       </w:r>
     </w:p>
     <w:p>
@@ -235,7 +235,7 @@
           <w:sz w:val="26"/>
           <w:szCs w:val="26"/>
         </w:rPr>
-        <w:t xml:space="preserve">Nội dung chính xác, có căn cứ; ví dụ minh họa dùng dữ liệu thật đã công bố; ngôn ngữ dễ hiểu với người nghe không chuyên về công nghệ thông tin.</w:t>
+        <w:t xml:space="preserve">Nội dung chính xác, có căn cứ; ví dụ minh họa dùng dữ liệu thật đã công bố; phần cần cài sẵn lỗi hoặc thay cho dữ liệu mật dùng dữ liệu giả lập, ghi rõ trên slide; ngôn ngữ dễ hiểu với người nghe không chuyên về công nghệ thông tin.</w:t>
       </w:r>
     </w:p>
     <w:p>
@@ -1437,7 +1437,582 @@
           <w:sz w:val="26"/>
           <w:szCs w:val="26"/>
         </w:rPr>
-        <w:t xml:space="preserve">III. ĐỊNH HƯỚNG NỘI DUNG TỪNG PHẦN</w:t>
+        <w:t xml:space="preserve">III. DỰ ÁN MINH HỌA</w:t>
+      </w:r>
+    </w:p>
+    <w:p>
+      <w:pPr>
+        <w:spacing w:after="60" w:before="60" w:line="300"/>
+        <w:ind w:firstLine="567"/>
+        <w:jc w:val="both"/>
+      </w:pPr>
+      <w:r>
+        <w:rPr>
+          <w:rFonts w:ascii="Times New Roman" w:cs="Times New Roman" w:eastAsia="Times New Roman" w:hAnsi="Times New Roman"/>
+          <w:sz w:val="26"/>
+          <w:szCs w:val="26"/>
+        </w:rPr>
+        <w:t xml:space="preserve">Các phần minh họa của bài trình bày được thực hiện trên hai dự án đã xây dựng hoàn chỉnh với sự hỗ trợ của AI Agent; toàn bộ kết quả chạy lại được bằng một lệnh.</w:t>
+      </w:r>
+    </w:p>
+    <w:tbl>
+      <w:tblPr>
+        <w:tblW w:type="dxa" w:w="9071"/>
+        <w:tblBorders>
+          <w:top w:val="single" w:color="auto" w:sz="4"/>
+          <w:left w:val="single" w:color="auto" w:sz="4"/>
+          <w:bottom w:val="single" w:color="auto" w:sz="4"/>
+          <w:right w:val="single" w:color="auto" w:sz="4"/>
+          <w:insideH w:val="single" w:color="auto" w:sz="4"/>
+          <w:insideV w:val="single" w:color="auto" w:sz="4"/>
+        </w:tblBorders>
+      </w:tblPr>
+      <w:tblGrid>
+        <w:gridCol w:w="520"/>
+        <w:gridCol w:w="2000"/>
+        <w:gridCol w:w="3851"/>
+        <w:gridCol w:w="1500"/>
+        <w:gridCol w:w="1200"/>
+      </w:tblGrid>
+      <w:tr>
+        <w:trPr>
+          <w:tblHeader/>
+        </w:trPr>
+        <w:tc>
+          <w:tcPr>
+            <w:tcW w:type="dxa" w:w="520"/>
+            <w:tcBorders>
+              <w:top w:val="single" w:color="000000" w:sz="4"/>
+              <w:left w:val="single" w:color="000000" w:sz="4"/>
+              <w:bottom w:val="single" w:color="000000" w:sz="4"/>
+              <w:right w:val="single" w:color="000000" w:sz="4"/>
+            </w:tcBorders>
+            <w:shd w:fill="E7E6E6" w:color="auto" w:val="clear"/>
+            <w:tcMar>
+              <w:top w:type="dxa" w:w="40"/>
+              <w:left w:type="dxa" w:w="80"/>
+              <w:bottom w:type="dxa" w:w="40"/>
+              <w:right w:type="dxa" w:w="80"/>
+            </w:tcMar>
+            <w:vAlign w:val="center"/>
+          </w:tcPr>
+          <w:p>
+            <w:pPr>
+              <w:spacing w:after="0" w:before="0" w:line="264"/>
+              <w:jc w:val="center"/>
+            </w:pPr>
+            <w:r>
+              <w:rPr>
+                <w:rFonts w:ascii="Times New Roman" w:cs="Times New Roman" w:eastAsia="Times New Roman" w:hAnsi="Times New Roman"/>
+                <w:b/>
+                <w:bCs/>
+                <w:sz w:val="24"/>
+                <w:szCs w:val="24"/>
+              </w:rPr>
+              <w:t xml:space="preserve">TT</w:t>
+            </w:r>
+          </w:p>
+        </w:tc>
+        <w:tc>
+          <w:tcPr>
+            <w:tcW w:type="dxa" w:w="2000"/>
+            <w:tcBorders>
+              <w:top w:val="single" w:color="000000" w:sz="4"/>
+              <w:left w:val="single" w:color="000000" w:sz="4"/>
+              <w:bottom w:val="single" w:color="000000" w:sz="4"/>
+              <w:right w:val="single" w:color="000000" w:sz="4"/>
+            </w:tcBorders>
+            <w:shd w:fill="E7E6E6" w:color="auto" w:val="clear"/>
+            <w:tcMar>
+              <w:top w:type="dxa" w:w="40"/>
+              <w:left w:type="dxa" w:w="80"/>
+              <w:bottom w:type="dxa" w:w="40"/>
+              <w:right w:type="dxa" w:w="80"/>
+            </w:tcMar>
+            <w:vAlign w:val="center"/>
+          </w:tcPr>
+          <w:p>
+            <w:pPr>
+              <w:spacing w:after="0" w:before="0" w:line="264"/>
+              <w:jc w:val="center"/>
+            </w:pPr>
+            <w:r>
+              <w:rPr>
+                <w:rFonts w:ascii="Times New Roman" w:cs="Times New Roman" w:eastAsia="Times New Roman" w:hAnsi="Times New Roman"/>
+                <w:b/>
+                <w:bCs/>
+                <w:sz w:val="24"/>
+                <w:szCs w:val="24"/>
+              </w:rPr>
+              <w:t xml:space="preserve">Dự án</w:t>
+            </w:r>
+          </w:p>
+        </w:tc>
+        <w:tc>
+          <w:tcPr>
+            <w:tcW w:type="dxa" w:w="3851"/>
+            <w:tcBorders>
+              <w:top w:val="single" w:color="000000" w:sz="4"/>
+              <w:left w:val="single" w:color="000000" w:sz="4"/>
+              <w:bottom w:val="single" w:color="000000" w:sz="4"/>
+              <w:right w:val="single" w:color="000000" w:sz="4"/>
+            </w:tcBorders>
+            <w:shd w:fill="E7E6E6" w:color="auto" w:val="clear"/>
+            <w:tcMar>
+              <w:top w:type="dxa" w:w="40"/>
+              <w:left w:type="dxa" w:w="80"/>
+              <w:bottom w:type="dxa" w:w="40"/>
+              <w:right w:type="dxa" w:w="80"/>
+            </w:tcMar>
+            <w:vAlign w:val="center"/>
+          </w:tcPr>
+          <w:p>
+            <w:pPr>
+              <w:spacing w:after="0" w:before="0" w:line="264"/>
+              <w:jc w:val="center"/>
+            </w:pPr>
+            <w:r>
+              <w:rPr>
+                <w:rFonts w:ascii="Times New Roman" w:cs="Times New Roman" w:eastAsia="Times New Roman" w:hAnsi="Times New Roman"/>
+                <w:b/>
+                <w:bCs/>
+                <w:sz w:val="24"/>
+                <w:szCs w:val="24"/>
+              </w:rPr>
+              <w:t xml:space="preserve">Nội dung chính</w:t>
+            </w:r>
+          </w:p>
+        </w:tc>
+        <w:tc>
+          <w:tcPr>
+            <w:tcW w:type="dxa" w:w="1500"/>
+            <w:tcBorders>
+              <w:top w:val="single" w:color="000000" w:sz="4"/>
+              <w:left w:val="single" w:color="000000" w:sz="4"/>
+              <w:bottom w:val="single" w:color="000000" w:sz="4"/>
+              <w:right w:val="single" w:color="000000" w:sz="4"/>
+            </w:tcBorders>
+            <w:shd w:fill="E7E6E6" w:color="auto" w:val="clear"/>
+            <w:tcMar>
+              <w:top w:type="dxa" w:w="40"/>
+              <w:left w:type="dxa" w:w="80"/>
+              <w:bottom w:type="dxa" w:w="40"/>
+              <w:right w:type="dxa" w:w="80"/>
+            </w:tcMar>
+            <w:vAlign w:val="center"/>
+          </w:tcPr>
+          <w:p>
+            <w:pPr>
+              <w:spacing w:after="0" w:before="0" w:line="264"/>
+              <w:jc w:val="center"/>
+            </w:pPr>
+            <w:r>
+              <w:rPr>
+                <w:rFonts w:ascii="Times New Roman" w:cs="Times New Roman" w:eastAsia="Times New Roman" w:hAnsi="Times New Roman"/>
+                <w:b/>
+                <w:bCs/>
+                <w:sz w:val="24"/>
+                <w:szCs w:val="24"/>
+              </w:rPr>
+              <w:t xml:space="preserve">Dữ liệu</w:t>
+            </w:r>
+          </w:p>
+        </w:tc>
+        <w:tc>
+          <w:tcPr>
+            <w:tcW w:type="dxa" w:w="1200"/>
+            <w:tcBorders>
+              <w:top w:val="single" w:color="000000" w:sz="4"/>
+              <w:left w:val="single" w:color="000000" w:sz="4"/>
+              <w:bottom w:val="single" w:color="000000" w:sz="4"/>
+              <w:right w:val="single" w:color="000000" w:sz="4"/>
+            </w:tcBorders>
+            <w:shd w:fill="E7E6E6" w:color="auto" w:val="clear"/>
+            <w:tcMar>
+              <w:top w:type="dxa" w:w="40"/>
+              <w:left w:type="dxa" w:w="80"/>
+              <w:bottom w:type="dxa" w:w="40"/>
+              <w:right w:type="dxa" w:w="80"/>
+            </w:tcMar>
+            <w:vAlign w:val="center"/>
+          </w:tcPr>
+          <w:p>
+            <w:pPr>
+              <w:spacing w:after="0" w:before="0" w:line="264"/>
+              <w:jc w:val="center"/>
+            </w:pPr>
+            <w:r>
+              <w:rPr>
+                <w:rFonts w:ascii="Times New Roman" w:cs="Times New Roman" w:eastAsia="Times New Roman" w:hAnsi="Times New Roman"/>
+                <w:b/>
+                <w:bCs/>
+                <w:sz w:val="24"/>
+                <w:szCs w:val="24"/>
+              </w:rPr>
+              <w:t xml:space="preserve">Sử dụng tại slide</w:t>
+            </w:r>
+          </w:p>
+        </w:tc>
+      </w:tr>
+      <w:tr>
+        <w:trPr>
+          <w:tblHeader w:val="false"/>
+        </w:trPr>
+        <w:tc>
+          <w:tcPr>
+            <w:tcW w:type="dxa" w:w="520"/>
+            <w:tcBorders>
+              <w:top w:val="single" w:color="000000" w:sz="4"/>
+              <w:left w:val="single" w:color="000000" w:sz="4"/>
+              <w:bottom w:val="single" w:color="000000" w:sz="4"/>
+              <w:right w:val="single" w:color="000000" w:sz="4"/>
+            </w:tcBorders>
+            <w:tcMar>
+              <w:top w:type="dxa" w:w="40"/>
+              <w:left w:type="dxa" w:w="80"/>
+              <w:bottom w:type="dxa" w:w="40"/>
+              <w:right w:type="dxa" w:w="80"/>
+            </w:tcMar>
+            <w:vAlign w:val="center"/>
+          </w:tcPr>
+          <w:p>
+            <w:pPr>
+              <w:spacing w:after="0" w:before="0" w:line="264"/>
+              <w:jc w:val="center"/>
+            </w:pPr>
+            <w:r>
+              <w:rPr>
+                <w:rFonts w:ascii="Times New Roman" w:cs="Times New Roman" w:eastAsia="Times New Roman" w:hAnsi="Times New Roman"/>
+                <w:sz w:val="24"/>
+                <w:szCs w:val="24"/>
+              </w:rPr>
+              <w:t xml:space="preserve">1</w:t>
+            </w:r>
+          </w:p>
+        </w:tc>
+        <w:tc>
+          <w:tcPr>
+            <w:tcW w:type="dxa" w:w="2000"/>
+            <w:tcBorders>
+              <w:top w:val="single" w:color="000000" w:sz="4"/>
+              <w:left w:val="single" w:color="000000" w:sz="4"/>
+              <w:bottom w:val="single" w:color="000000" w:sz="4"/>
+              <w:right w:val="single" w:color="000000" w:sz="4"/>
+            </w:tcBorders>
+            <w:tcMar>
+              <w:top w:type="dxa" w:w="40"/>
+              <w:left w:type="dxa" w:w="80"/>
+              <w:bottom w:type="dxa" w:w="40"/>
+              <w:right w:type="dxa" w:w="80"/>
+            </w:tcMar>
+            <w:vAlign w:val="center"/>
+          </w:tcPr>
+          <w:p>
+            <w:pPr>
+              <w:spacing w:after="0" w:before="0" w:line="264"/>
+              <w:jc w:val="left"/>
+            </w:pPr>
+            <w:r>
+              <w:rPr>
+                <w:rFonts w:ascii="Times New Roman" w:cs="Times New Roman" w:eastAsia="Times New Roman" w:hAnsi="Times New Roman"/>
+                <w:b w:val="false"/>
+                <w:bCs w:val="false"/>
+                <w:sz w:val="24"/>
+                <w:szCs w:val="24"/>
+              </w:rPr>
+              <w:t xml:space="preserve">Dự án nghiên cứu “Khả năng áp dụng mô hình ăn mòn khí quyển quốc tế cho khí hậu nhiệt đới Việt Nam”</w:t>
+            </w:r>
+          </w:p>
+        </w:tc>
+        <w:tc>
+          <w:tcPr>
+            <w:tcW w:type="dxa" w:w="3851"/>
+            <w:tcBorders>
+              <w:top w:val="single" w:color="000000" w:sz="4"/>
+              <w:left w:val="single" w:color="000000" w:sz="4"/>
+              <w:bottom w:val="single" w:color="000000" w:sz="4"/>
+              <w:right w:val="single" w:color="000000" w:sz="4"/>
+            </w:tcBorders>
+            <w:tcMar>
+              <w:top w:type="dxa" w:w="40"/>
+              <w:left w:type="dxa" w:w="80"/>
+              <w:bottom w:type="dxa" w:w="40"/>
+              <w:right w:type="dxa" w:w="80"/>
+            </w:tcMar>
+            <w:vAlign w:val="center"/>
+          </w:tcPr>
+          <w:p>
+            <w:pPr>
+              <w:spacing w:after="0" w:before="0" w:line="264"/>
+              <w:jc w:val="left"/>
+            </w:pPr>
+            <w:r>
+              <w:rPr>
+                <w:rFonts w:ascii="Times New Roman" w:cs="Times New Roman" w:eastAsia="Times New Roman" w:hAnsi="Times New Roman"/>
+                <w:b w:val="false"/>
+                <w:bCs w:val="false"/>
+                <w:sz w:val="24"/>
+                <w:szCs w:val="24"/>
+              </w:rPr>
+              <w:t xml:space="preserve">Thực hiện đủ vòng đời một nhiệm vụ: tổng quan tài liệu (13 tài liệu đã xác minh, ma trận bằng chứng, 3 khoảng trống) → bản nháp đề xuất → hợp nhất, kiểm tra dữ liệu → mô hình, hiệu chỉnh theo vùng → mô hình 3D → bản thảo bài báo → báo cáo tổng hợp; có nhật ký thực hiện, ghi cả các lần sai và sửa</w:t>
+            </w:r>
+          </w:p>
+        </w:tc>
+        <w:tc>
+          <w:tcPr>
+            <w:tcW w:type="dxa" w:w="1500"/>
+            <w:tcBorders>
+              <w:top w:val="single" w:color="000000" w:sz="4"/>
+              <w:left w:val="single" w:color="000000" w:sz="4"/>
+              <w:bottom w:val="single" w:color="000000" w:sz="4"/>
+              <w:right w:val="single" w:color="000000" w:sz="4"/>
+            </w:tcBorders>
+            <w:tcMar>
+              <w:top w:type="dxa" w:w="40"/>
+              <w:left w:type="dxa" w:w="80"/>
+              <w:bottom w:type="dxa" w:w="40"/>
+              <w:right w:type="dxa" w:w="80"/>
+            </w:tcMar>
+            <w:vAlign w:val="center"/>
+          </w:tcPr>
+          <w:p>
+            <w:pPr>
+              <w:spacing w:after="0" w:before="0" w:line="264"/>
+              <w:jc w:val="left"/>
+            </w:pPr>
+            <w:r>
+              <w:rPr>
+                <w:rFonts w:ascii="Times New Roman" w:cs="Times New Roman" w:eastAsia="Times New Roman" w:hAnsi="Times New Roman"/>
+                <w:b w:val="false"/>
+                <w:bCs w:val="false"/>
+                <w:sz w:val="24"/>
+                <w:szCs w:val="24"/>
+              </w:rPr>
+              <w:t xml:space="preserve">Thật, đã công bố: 387 số đo thực địa (kho dữ liệu mở C-OLR, giấy phép MIT)</w:t>
+            </w:r>
+          </w:p>
+        </w:tc>
+        <w:tc>
+          <w:tcPr>
+            <w:tcW w:type="dxa" w:w="1200"/>
+            <w:tcBorders>
+              <w:top w:val="single" w:color="000000" w:sz="4"/>
+              <w:left w:val="single" w:color="000000" w:sz="4"/>
+              <w:bottom w:val="single" w:color="000000" w:sz="4"/>
+              <w:right w:val="single" w:color="000000" w:sz="4"/>
+            </w:tcBorders>
+            <w:tcMar>
+              <w:top w:type="dxa" w:w="40"/>
+              <w:left w:type="dxa" w:w="80"/>
+              <w:bottom w:type="dxa" w:w="40"/>
+              <w:right w:type="dxa" w:w="80"/>
+            </w:tcMar>
+            <w:vAlign w:val="center"/>
+          </w:tcPr>
+          <w:p>
+            <w:pPr>
+              <w:spacing w:after="0" w:before="0" w:line="264"/>
+              <w:jc w:val="center"/>
+            </w:pPr>
+            <w:r>
+              <w:rPr>
+                <w:rFonts w:ascii="Times New Roman" w:cs="Times New Roman" w:eastAsia="Times New Roman" w:hAnsi="Times New Roman"/>
+                <w:sz w:val="24"/>
+                <w:szCs w:val="24"/>
+              </w:rPr>
+              <w:t xml:space="preserve">9, 10, 12 – 19, 24, 25</w:t>
+            </w:r>
+          </w:p>
+        </w:tc>
+      </w:tr>
+      <w:tr>
+        <w:trPr>
+          <w:tblHeader w:val="false"/>
+        </w:trPr>
+        <w:tc>
+          <w:tcPr>
+            <w:tcW w:type="dxa" w:w="520"/>
+            <w:tcBorders>
+              <w:top w:val="single" w:color="000000" w:sz="4"/>
+              <w:left w:val="single" w:color="000000" w:sz="4"/>
+              <w:bottom w:val="single" w:color="000000" w:sz="4"/>
+              <w:right w:val="single" w:color="000000" w:sz="4"/>
+            </w:tcBorders>
+            <w:tcMar>
+              <w:top w:type="dxa" w:w="40"/>
+              <w:left w:type="dxa" w:w="80"/>
+              <w:bottom w:type="dxa" w:w="40"/>
+              <w:right w:type="dxa" w:w="80"/>
+            </w:tcMar>
+            <w:vAlign w:val="center"/>
+          </w:tcPr>
+          <w:p>
+            <w:pPr>
+              <w:spacing w:after="0" w:before="0" w:line="264"/>
+              <w:jc w:val="center"/>
+            </w:pPr>
+            <w:r>
+              <w:rPr>
+                <w:rFonts w:ascii="Times New Roman" w:cs="Times New Roman" w:eastAsia="Times New Roman" w:hAnsi="Times New Roman"/>
+                <w:sz w:val="24"/>
+                <w:szCs w:val="24"/>
+              </w:rPr>
+              <w:t xml:space="preserve">2</w:t>
+            </w:r>
+          </w:p>
+        </w:tc>
+        <w:tc>
+          <w:tcPr>
+            <w:tcW w:type="dxa" w:w="2000"/>
+            <w:tcBorders>
+              <w:top w:val="single" w:color="000000" w:sz="4"/>
+              <w:left w:val="single" w:color="000000" w:sz="4"/>
+              <w:bottom w:val="single" w:color="000000" w:sz="4"/>
+              <w:right w:val="single" w:color="000000" w:sz="4"/>
+            </w:tcBorders>
+            <w:tcMar>
+              <w:top w:type="dxa" w:w="40"/>
+              <w:left w:type="dxa" w:w="80"/>
+              <w:bottom w:type="dxa" w:w="40"/>
+              <w:right w:type="dxa" w:w="80"/>
+            </w:tcMar>
+            <w:vAlign w:val="center"/>
+          </w:tcPr>
+          <w:p>
+            <w:pPr>
+              <w:spacing w:after="0" w:before="0" w:line="264"/>
+              <w:jc w:val="left"/>
+            </w:pPr>
+            <w:r>
+              <w:rPr>
+                <w:rFonts w:ascii="Times New Roman" w:cs="Times New Roman" w:eastAsia="Times New Roman" w:hAnsi="Times New Roman"/>
+                <w:b w:val="false"/>
+                <w:bCs w:val="false"/>
+                <w:sz w:val="24"/>
+                <w:szCs w:val="24"/>
+              </w:rPr>
+              <w:t xml:space="preserve">Bộ minh họa của bài trình bày</w:t>
+            </w:r>
+          </w:p>
+        </w:tc>
+        <w:tc>
+          <w:tcPr>
+            <w:tcW w:type="dxa" w:w="3851"/>
+            <w:tcBorders>
+              <w:top w:val="single" w:color="000000" w:sz="4"/>
+              <w:left w:val="single" w:color="000000" w:sz="4"/>
+              <w:bottom w:val="single" w:color="000000" w:sz="4"/>
+              <w:right w:val="single" w:color="000000" w:sz="4"/>
+            </w:tcBorders>
+            <w:tcMar>
+              <w:top w:type="dxa" w:w="40"/>
+              <w:left w:type="dxa" w:w="80"/>
+              <w:bottom w:type="dxa" w:w="40"/>
+              <w:right w:type="dxa" w:w="80"/>
+            </w:tcMar>
+            <w:vAlign w:val="center"/>
+          </w:tcPr>
+          <w:p>
+            <w:pPr>
+              <w:spacing w:after="0" w:before="0" w:line="264"/>
+              <w:jc w:val="left"/>
+            </w:pPr>
+            <w:r>
+              <w:rPr>
+                <w:rFonts w:ascii="Times New Roman" w:cs="Times New Roman" w:eastAsia="Times New Roman" w:hAnsi="Times New Roman"/>
+                <w:b w:val="false"/>
+                <w:bCs w:val="false"/>
+                <w:sz w:val="24"/>
+                <w:szCs w:val="24"/>
+              </w:rPr>
+              <w:t xml:space="preserve">Tổng hợp dữ liệu từ 3 nguồn công bố, 4 định dạng; bộ dữ liệu ăn mòn, khí tượng và kế hoạch công việc có cài sẵn lỗi để AI phát hiện; công cụ ước lượng lộ trình thiết bị bay không người lái chạy trên máy không kết nối Internet</w:t>
+            </w:r>
+          </w:p>
+        </w:tc>
+        <w:tc>
+          <w:tcPr>
+            <w:tcW w:type="dxa" w:w="1500"/>
+            <w:tcBorders>
+              <w:top w:val="single" w:color="000000" w:sz="4"/>
+              <w:left w:val="single" w:color="000000" w:sz="4"/>
+              <w:bottom w:val="single" w:color="000000" w:sz="4"/>
+              <w:right w:val="single" w:color="000000" w:sz="4"/>
+            </w:tcBorders>
+            <w:tcMar>
+              <w:top w:type="dxa" w:w="40"/>
+              <w:left w:type="dxa" w:w="80"/>
+              <w:bottom w:type="dxa" w:w="40"/>
+              <w:right w:type="dxa" w:w="80"/>
+            </w:tcMar>
+            <w:vAlign w:val="center"/>
+          </w:tcPr>
+          <w:p>
+            <w:pPr>
+              <w:spacing w:after="0" w:before="0" w:line="264"/>
+              <w:jc w:val="left"/>
+            </w:pPr>
+            <w:r>
+              <w:rPr>
+                <w:rFonts w:ascii="Times New Roman" w:cs="Times New Roman" w:eastAsia="Times New Roman" w:hAnsi="Times New Roman"/>
+                <w:b w:val="false"/>
+                <w:bCs w:val="false"/>
+                <w:sz w:val="24"/>
+                <w:szCs w:val="24"/>
+              </w:rPr>
+              <w:t xml:space="preserve">Thật (trích từ C-OLR) và giả lập</w:t>
+            </w:r>
+          </w:p>
+        </w:tc>
+        <w:tc>
+          <w:tcPr>
+            <w:tcW w:type="dxa" w:w="1200"/>
+            <w:tcBorders>
+              <w:top w:val="single" w:color="000000" w:sz="4"/>
+              <w:left w:val="single" w:color="000000" w:sz="4"/>
+              <w:bottom w:val="single" w:color="000000" w:sz="4"/>
+              <w:right w:val="single" w:color="000000" w:sz="4"/>
+            </w:tcBorders>
+            <w:tcMar>
+              <w:top w:type="dxa" w:w="40"/>
+              <w:left w:type="dxa" w:w="80"/>
+              <w:bottom w:type="dxa" w:w="40"/>
+              <w:right w:type="dxa" w:w="80"/>
+            </w:tcMar>
+            <w:vAlign w:val="center"/>
+          </w:tcPr>
+          <w:p>
+            <w:pPr>
+              <w:spacing w:after="0" w:before="0" w:line="264"/>
+              <w:jc w:val="center"/>
+            </w:pPr>
+            <w:r>
+              <w:rPr>
+                <w:rFonts w:ascii="Times New Roman" w:cs="Times New Roman" w:eastAsia="Times New Roman" w:hAnsi="Times New Roman"/>
+                <w:sz w:val="24"/>
+                <w:szCs w:val="24"/>
+              </w:rPr>
+              <w:t xml:space="preserve">8, 14, 16, 22</w:t>
+            </w:r>
+          </w:p>
+        </w:tc>
+      </w:tr>
+    </w:tbl>
+    <w:p>
+      <w:pPr>
+        <w:keepNext/>
+        <w:spacing w:after="60" w:before="180" w:line="300"/>
+        <w:ind w:firstLine="567"/>
+        <w:jc w:val="both"/>
+      </w:pPr>
+      <w:r>
+        <w:rPr>
+          <w:rFonts w:ascii="Times New Roman" w:cs="Times New Roman" w:eastAsia="Times New Roman" w:hAnsi="Times New Roman"/>
+          <w:b/>
+          <w:bCs/>
+          <w:sz w:val="26"/>
+          <w:szCs w:val="26"/>
+        </w:rPr>
+        <w:t xml:space="preserve">IV. ĐỊNH HƯỚNG NỘI DUNG TỪNG PHẦN</w:t>
       </w:r>
     </w:p>
     <w:p>
@@ -1660,7 +2235,7 @@
           <w:sz w:val="26"/>
           <w:szCs w:val="26"/>
         </w:rPr>
-        <w:t xml:space="preserve">Giới thiệu Claude trên Windows: các mô hình, năm tính năng dùng ngay (dự án, tạo tệp – chạy mã, nghiên cứu chuyên sâu, Cowork, tác vụ theo lịch); sáu bước bắt đầu sử dụng; minh họa tổng hợp dữ liệu từ 3 nguồn công bố.</w:t>
+        <w:t xml:space="preserve">Giới thiệu Claude trên Windows: các mô hình, năm tính năng dùng ngay (dự án, tạo tệp – chạy mã, nghiên cứu chuyên sâu, Cowork, tác vụ theo lịch); sáu bước bắt đầu sử dụng; minh họa tổng hợp dữ liệu từ 3 nguồn công bố (Dự án 2): 4 tệp khác định dạng → bảng tổng hợp, báo cáo Word; AI phát hiện nhãn đơn vị sai trong nguồn.</w:t>
       </w:r>
     </w:p>
     <w:p>
@@ -1679,7 +2254,7 @@
           <w:sz w:val="26"/>
           <w:szCs w:val="26"/>
         </w:rPr>
-        <w:t xml:space="preserve">Phương pháp giao việc cho AI Agent theo 5 bước (nhiệm vụ – dữ liệu – đầu ra – dẫn nguồn, lưu mã – kiểm tra).</w:t>
+        <w:t xml:space="preserve">Phương pháp giao việc cho AI Agent theo 5 bước (nhiệm vụ – dữ liệu – đầu ra – dẫn nguồn, lưu mã – kiểm tra); ví dụ câu lệnh đủ 5 bước trên dữ liệu thật của Dự án 1.</w:t>
       </w:r>
     </w:p>
     <w:p>
@@ -1698,7 +2273,7 @@
           <w:sz w:val="26"/>
           <w:szCs w:val="26"/>
         </w:rPr>
-        <w:t xml:space="preserve">Tổ chức không gian làm việc theo từng nhiệm vụ; giới thiệu Skill, Subagent và hệ thống nhiều Agent.</w:t>
+        <w:t xml:space="preserve">Tổ chức không gian làm việc theo từng nhiệm vụ, lấy cấu trúc Dự án 1 làm mẫu (mỗi giai đoạn của nhiệm vụ một thư mục, từ quản lý dự án, tài liệu đến bài báo, báo cáo); giới thiệu Skill, Subagent và hệ thống nhiều Agent.</w:t>
       </w:r>
     </w:p>
     <w:p>
@@ -1743,7 +2318,7 @@
           <w:sz w:val="26"/>
           <w:szCs w:val="26"/>
         </w:rPr>
-        <w:t xml:space="preserve">minh họa AI hỗ trợ từng công đoạn của một nhiệm vụ khoa học và công nghệ, trên ví dụ “Khả năng áp dụng mô hình ăn mòn khí quyển quốc tế cho khí hậu nhiệt đới Việt Nam” (387 số đo thực địa đã công bố).</w:t>
+        <w:t xml:space="preserve">minh họa AI hỗ trợ từng công đoạn của một nhiệm vụ khoa học và công nghệ, theo đúng trình tự các giai đoạn của Dự án 1; phần minh họa phát hiện lỗi dùng dữ liệu giả lập của Dự án 2.</w:t>
       </w:r>
     </w:p>
     <w:p>
@@ -1762,7 +2337,7 @@
           <w:sz w:val="26"/>
           <w:szCs w:val="26"/>
         </w:rPr>
-        <w:t xml:space="preserve">Nghiên cứu tài liệu và tổng quan: tìm bài ứng viên bằng Sci-Bot – trợ lý AI trên kho Sci-Hub (câu trả lời tổng hợp kèm danh sách bài báo, DOI), bổ sung bài mới bằng Google Scholar Labs, Semantic Scholar; lọc theo tiêu đề, tóm tắt (Elicit, Consensus, Claude); lấy toàn văn theo DOI qua Sci-Hub, Unpaywall, CORE và nguồn tiếng Việt – tiếng Nga (VJOL, CyberLeninka, eLIBRARY.ru); lập ma trận bằng chứng, xác định 3 khoảng trống nghiên cứu; kiểm tra DOI của mọi trích dẫn.</w:t>
+        <w:t xml:space="preserve">Nghiên cứu tài liệu và tổng quan: tìm bài ứng viên bằng Sci-Bot – trợ lý AI trên kho Sci-Hub (câu trả lời tổng hợp kèm danh sách bài báo, DOI), bổ sung bài mới bằng Google Scholar Labs, Semantic Scholar; lọc theo tiêu đề, tóm tắt (Elicit, Consensus, Claude); lấy toàn văn theo DOI qua Sci-Hub, Unpaywall, CORE và nguồn tiếng Việt – tiếng Nga (VJOL, CyberLeninka, eLIBRARY.ru); lập ma trận bằng chứng từ 13 tài liệu đã xác minh, xác định 3 khoảng trống nghiên cứu (Dự án 1); kiểm tra DOI của mọi trích dẫn.</w:t>
       </w:r>
     </w:p>
     <w:p>
@@ -1781,7 +2356,7 @@
           <w:sz w:val="26"/>
           <w:szCs w:val="26"/>
         </w:rPr>
-        <w:t xml:space="preserve">Xây dựng thuyết minh đề tài từ khoảng trống đã chọn (minh họa 1): phiếu đề xuất, thuyết minh theo biểu mẫu của Trung tâm; tiến độ, dự toán theo Thông tư 03/2023/TT-BTC và quy định của Bộ Quốc phòng.</w:t>
+        <w:t xml:space="preserve">Xây dựng thuyết minh đề tài từ khoảng trống thứ nhất của Dự án 1 (minh họa 1): phiếu đề xuất, thuyết minh theo biểu mẫu của Trung tâm; tiến độ, dự toán theo Thông tư 03/2023/TT-BTC và quy định của Bộ Quốc phòng; với kế hoạch công việc giả lập (Dự án 2), AI phát hiện đủ 3 bất hợp lý cài sẵn về trình tự công việc.</w:t>
       </w:r>
     </w:p>
     <w:p>
@@ -1819,7 +2394,7 @@
           <w:sz w:val="26"/>
           <w:szCs w:val="26"/>
         </w:rPr>
-        <w:t xml:space="preserve">Minh họa 2 – áp dụng quy trình trên: AI viết và chạy mã Python xử lý dữ liệu, phát hiện lỗi đơn vị trong dữ liệu công bố; mô hình quốc tế dự đoán thấp hơn thực đo ở Việt Nam khoảng 31%; sau hiệu chỉnh theo vùng, xếp đúng cấp ăn mòn 9/12 trạm (trước là 2/12).</w:t>
+        <w:t xml:space="preserve">Minh họa 2 – áp dụng quy trình trên: AI viết và chạy mã Python xử lý dữ liệu. Với dữ liệu giả lập (Dự án 2): phát hiện đủ 14/14 lỗi cài sẵn. Với 387 số đo thật (Dự án 1): phát hiện lỗi đơn vị trong dữ liệu công bố; mô hình quốc tế dự đoán thấp hơn thực đo ở Việt Nam khoảng 31%; sau hiệu chỉnh theo vùng, xếp đúng cấp ăn mòn 9/12 trạm (trước là 2/12).</w:t>
       </w:r>
     </w:p>
     <w:p>
@@ -1838,7 +2413,7 @@
           <w:sz w:val="26"/>
           <w:szCs w:val="26"/>
         </w:rPr>
-        <w:t xml:space="preserve">Mô hình 3D mô phỏng quá trình ăn mòn thép tại Nha Trang trong 30 năm và so sánh thép – kẽm – đồng – nhôm.</w:t>
+        <w:t xml:space="preserve">Mô hình 3D tương tác (Dự án 1) mô phỏng quá trình ăn mòn thép tại Nha Trang trong 30 năm và so sánh thép – kẽm – đồng – nhôm.</w:t>
       </w:r>
     </w:p>
     <w:p>
@@ -1857,7 +2432,7 @@
           <w:sz w:val="26"/>
           <w:szCs w:val="26"/>
         </w:rPr>
-        <w:t xml:space="preserve">Công bố kết quả theo nhiều định dạng: tạp chí Scopus/Web of Science, danh mục ВАК (Nga), tạp chí trong nước, báo cáo của Trung tâm; nhà khoa học xác nhận ở mỗi bước.</w:t>
+        <w:t xml:space="preserve">Công bố kết quả: bản thảo bài báo (tóm tắt Việt – Anh) và báo cáo tổng hợp của Dự án 1; chuyển đổi theo nhiều định dạng: tạp chí Scopus/Web of Science, danh mục ВАК (Nga), tạp chí trong nước, báo cáo của Trung tâm; nhà khoa học xác nhận ở mỗi bước.</w:t>
       </w:r>
     </w:p>
     <w:p>
@@ -1959,7 +2534,7 @@
           <w:sz w:val="26"/>
           <w:szCs w:val="26"/>
         </w:rPr>
-        <w:t xml:space="preserve">Minh họa 3 (dữ liệu giả lập): công cụ ước lượng lộ trình thiết bị bay không người lái theo địa hình và khí hậu nhiệt đới.</w:t>
+        <w:t xml:space="preserve">Minh họa 3 (Dự án 2, dữ liệu giả lập thay cho dữ liệu mật): công cụ ước lượng lộ trình thiết bị bay không người lái theo địa hình và khí hậu nhiệt đới – lộ trình vòng tránh 8 ô cấm bay; chiều về ngược gió mùa tốn năng lượng gấp 1,8 lần chiều đi nên phải đổi phương án; quét mã không phát hiện kết nối mạng, mã băm trên máy đích khớp.</w:t>
       </w:r>
     </w:p>
     <w:p>
@@ -2042,7 +2617,7 @@
           <w:sz w:val="26"/>
           <w:szCs w:val="26"/>
         </w:rPr>
-        <w:t xml:space="preserve">Skill và thư viện Skill khoa học mở; kết quả thí nghiệm khi không dùng và có dùng Skill.</w:t>
+        <w:t xml:space="preserve">Skill và thư viện Skill khoa học mở; thí nghiệm trên 387 số đo của Dự án 1 khi không dùng và có dùng Skill: Skill bổ sung 3 bước kiểm tra mà phân tích ban đầu bỏ qua.</w:t>
       </w:r>
     </w:p>
     <w:p>
@@ -2061,7 +2636,7 @@
           <w:sz w:val="26"/>
           <w:szCs w:val="26"/>
         </w:rPr>
-        <w:t xml:space="preserve">Khoa học mở; ba mức tự động hóa (hỗ trợ từng bước – bán tự động – tự động toàn trình).</w:t>
+        <w:t xml:space="preserve">Khoa học mở qua vòng đời bộ dữ liệu của Dự án 1: dữ liệu công bố mở → tái sử dụng → phát hiện lỗi đơn vị → tri thức mới → đóng góp lại cộng đồng; ba mức tự động hóa (hỗ trợ từng bước – bán tự động – tự động toàn trình).</w:t>
       </w:r>
     </w:p>
     <w:p>
@@ -2143,7 +2718,7 @@
           <w:sz w:val="26"/>
           <w:szCs w:val="26"/>
         </w:rPr>
-        <w:t xml:space="preserve">IV. YÊU CẦU VỀ BẢO MẬT VÀ AN TOÀN THÔNG TIN</w:t>
+        <w:t xml:space="preserve">V. YÊU CẦU VỀ BẢO MẬT VÀ AN TOÀN THÔNG TIN</w:t>
       </w:r>
     </w:p>
     <w:p>
@@ -2218,7 +2793,7 @@
           <w:sz w:val="26"/>
           <w:szCs w:val="26"/>
         </w:rPr>
-        <w:t xml:space="preserve">V. CÔNG TÁC CHUẨN BỊ</w:t>
+        <w:t xml:space="preserve">VI. CÔNG TÁC CHUẨN BỊ</w:t>
       </w:r>
     </w:p>
     <w:tbl>
@@ -2486,7 +3061,7 @@
                 <w:sz w:val="24"/>
                 <w:szCs w:val="24"/>
               </w:rPr>
-              <w:t xml:space="preserve">Hoàn thiện bài trình bày; thực hiện trước và ghi hình các phần minh họa</w:t>
+              <w:t xml:space="preserve">Hoàn thiện bài trình bày; chạy lại 2 dự án minh họa, thực hiện trước và ghi hình các phần minh họa</w:t>
             </w:r>
           </w:p>
         </w:tc>
@@ -2588,7 +3163,7 @@
                 <w:sz w:val="24"/>
                 <w:szCs w:val="24"/>
               </w:rPr>
-              <w:t xml:space="preserve">Bộ slide, video, ảnh</w:t>
+              <w:t xml:space="preserve">Bộ slide, video, ảnh; kết quả 2 dự án</w:t>
             </w:r>
           </w:p>
         </w:tc>

</xml_diff>

<commit_message>
Phụ lục định hướng: mục đích và Phần I đặt trọng tâm định hướng nhận thức về AI
- Mục đích đầu tiên: định hướng lại nhận thức – không còn câu hỏi AI có hiệu
  quả hay không, mà là sử dụng thế nào cho hiệu quả và có trách nhiệm;
  khắc phục hai tâm lý: không biết khai thác nên không dùng; dùng thiếu kiểm soát
- Phần I: mục tiêu định hướng nhận thức; vị trí chiến lược của AI (Hoa Kỳ:
  Sứ mệnh Genesis, siêu trí tuệ gắn với an ninh quốc gia; Việt Nam: Nghị quyết
  57-NQ/TW); hai tâm lý cần khắc phục và cách khắc phục

Co-Authored-By: Claude Opus 5.5 <noreply@anthropic.com>
Claude-Session: https://claude.ai/code/session_01GnZXc8ffTcYAj23tD34VwM
</commit_message>
<xml_diff>
--- a/thuyet-trinh/ke-hoach-hoi-thao/PHU-LUC-DINH-HUONG-TRINH-BAY.docx
+++ b/thuyet-trinh/ke-hoach-hoi-thao/PHU-LUC-DINH-HUONG-TRINH-BAY.docx
@@ -120,7 +120,26 @@
           <w:sz w:val="26"/>
           <w:szCs w:val="26"/>
         </w:rPr>
-        <w:t xml:space="preserve">Cập nhật cho cán bộ, nhà khoa học của Trung tâm tốc độ phát triển, năng lực và xu thế ứng dụng trí tuệ nhân tạo (AI), đặc biệt là AI Agent, trong nghiên cứu khoa học.</w:t>
+        <w:t xml:space="preserve">Định hướng lại nhận thức của cán bộ, nhà khoa học của Trung tâm về trí tuệ nhân tạo (AI): AI đã chứng minh hiệu quả trong nghiên cứu khoa học và được nhiều quốc gia đặt lên hàng đầu, gắn với an ninh quốc gia; vấn đề không còn là AI có hiệu quả hay không, mà là sử dụng AI như thế nào cho hiệu quả và có trách nhiệm.</w:t>
+      </w:r>
+    </w:p>
+    <w:p>
+      <w:pPr>
+        <w:pStyle w:val="ListParagraph"/>
+        <w:numPr>
+          <w:ilvl w:val="0"/>
+          <w:numId w:val="2"/>
+        </w:numPr>
+        <w:spacing w:after="30" w:before="30" w:line="300"/>
+        <w:jc w:val="both"/>
+      </w:pPr>
+      <w:r>
+        <w:rPr>
+          <w:rFonts w:ascii="Times New Roman" w:cs="Times New Roman" w:eastAsia="Times New Roman" w:hAnsi="Times New Roman"/>
+          <w:sz w:val="26"/>
+          <w:szCs w:val="26"/>
+        </w:rPr>
+        <w:t xml:space="preserve">Khắc phục hai tâm lý chưa đúng hiện nay: một là chưa biết cách khai thác nên cho rằng AI không hiệu quả và không sử dụng; hai là có sử dụng nhưng thiếu trách nhiệm, không kiểm soát kết quả và dữ liệu đưa lên AI.</w:t>
       </w:r>
     </w:p>
     <w:p>
@@ -538,7 +557,7 @@
                 <w:sz w:val="24"/>
                 <w:szCs w:val="24"/>
               </w:rPr>
-              <w:t xml:space="preserve">Tổng quan: AI và sự thay đổi phương thức nghiên cứu khoa học</w:t>
+              <w:t xml:space="preserve">Tổng quan: định hướng nhận thức – sử dụng AI hiệu quả và có trách nhiệm; AI và sự thay đổi phương thức nghiên cứu khoa học</w:t>
             </w:r>
           </w:p>
         </w:tc>
@@ -2032,7 +2051,7 @@
           <w:sz w:val="26"/>
           <w:szCs w:val="26"/>
         </w:rPr>
-        <w:t xml:space="preserve">1. Phần I – Tổng quan (18 phút)</w:t>
+        <w:t xml:space="preserve">1. Phần I – Tổng quan: định hướng nhận thức về AI (18 phút)</w:t>
       </w:r>
     </w:p>
     <w:p>
@@ -2057,7 +2076,7 @@
           <w:sz w:val="26"/>
           <w:szCs w:val="26"/>
         </w:rPr>
-        <w:t xml:space="preserve">nắm được tốc độ phát triển, năng lực, giới hạn của AI và xu thế thay đổi phương thức nghiên cứu.</w:t>
+        <w:t xml:space="preserve">định hướng lại nhận thức – không còn câu hỏi AI có hiệu quả hay không, mà là sử dụng AI như thế nào cho hiệu quả và có trách nhiệm.</w:t>
       </w:r>
     </w:p>
     <w:p>
@@ -2076,7 +2095,7 @@
           <w:sz w:val="26"/>
           <w:szCs w:val="26"/>
         </w:rPr>
-        <w:t xml:space="preserve">Số liệu phát triển: khoảng một nửa dân số dùng AI tạo sinh chỉ sau 3 năm; AI đạt mức huy chương vàng Olympic Toán quốc tế 2025; độ dài công việc AI tự thực hiện được tăng từ vài giây (2019) lên hơn 16 giờ (2026).</w:t>
+        <w:t xml:space="preserve">Vị trí chiến lược của AI: nhiều quốc gia đặt AI lên hàng đầu, ngang với an ninh quốc gia. Hoa Kỳ khởi động “Sứ mệnh Genesis” (Sắc lệnh 14363, tháng 11/2025) dùng AI tăng tốc khám phá khoa học, được ví với Dự án Manhattan; từ tháng 9/2026 dùng khái niệm “siêu trí tuệ” trong văn bản của Chính phủ liên bang, thành lập Lực lượng Siêu trí tuệ do Giám đốc Tình báo Quốc gia đứng đầu và xác định đây là vấn đề an ninh quốc gia. Ở Việt Nam, Nghị quyết số 57-NQ/TW của Bộ Chính trị xác định phát triển khoa học, công nghệ, đổi mới sáng tạo và chuyển đổi số là đột phá quan trọng hàng đầu.</w:t>
       </w:r>
     </w:p>
     <w:p>
@@ -2095,7 +2114,7 @@
           <w:sz w:val="26"/>
           <w:szCs w:val="26"/>
         </w:rPr>
-        <w:t xml:space="preserve">Ví dụ ứng dụng AI trong viễn thám, khí tượng, sinh học, vật liệu – liên hệ với các hướng nghiên cứu của Trung tâm.</w:t>
+        <w:t xml:space="preserve">Bằng chứng về hiệu quả – số liệu phát triển: khoảng một nửa dân số dùng AI tạo sinh chỉ sau 3 năm; AI đạt mức huy chương vàng Olympic Toán quốc tế 2025; độ dài công việc AI tự thực hiện được tăng từ vài giây (2019) lên hơn 16 giờ (2026).</w:t>
       </w:r>
     </w:p>
     <w:p>
@@ -2114,7 +2133,45 @@
           <w:sz w:val="26"/>
           <w:szCs w:val="26"/>
         </w:rPr>
+        <w:t xml:space="preserve">Ví dụ ứng dụng AI trong viễn thám, khí tượng, sinh học, vật liệu – liên hệ với các hướng nghiên cứu của Trung tâm.</w:t>
+      </w:r>
+    </w:p>
+    <w:p>
+      <w:pPr>
+        <w:pStyle w:val="ListParagraph"/>
+        <w:numPr>
+          <w:ilvl w:val="0"/>
+          <w:numId w:val="2"/>
+        </w:numPr>
+        <w:spacing w:after="30" w:before="30" w:line="300"/>
+        <w:jc w:val="both"/>
+      </w:pPr>
+      <w:r>
+        <w:rPr>
+          <w:rFonts w:ascii="Times New Roman" w:cs="Times New Roman" w:eastAsia="Times New Roman" w:hAnsi="Times New Roman"/>
+          <w:sz w:val="26"/>
+          <w:szCs w:val="26"/>
+        </w:rPr>
         <w:t xml:space="preserve">Sáu năng lực cốt lõi và các tính năng mới của AI Agent; giới hạn: AI vẫn có thể sai, nhà khoa học phải kiểm tra.</w:t>
+      </w:r>
+    </w:p>
+    <w:p>
+      <w:pPr>
+        <w:pStyle w:val="ListParagraph"/>
+        <w:numPr>
+          <w:ilvl w:val="0"/>
+          <w:numId w:val="2"/>
+        </w:numPr>
+        <w:spacing w:after="30" w:before="30" w:line="300"/>
+        <w:jc w:val="both"/>
+      </w:pPr>
+      <w:r>
+        <w:rPr>
+          <w:rFonts w:ascii="Times New Roman" w:cs="Times New Roman" w:eastAsia="Times New Roman" w:hAnsi="Times New Roman"/>
+          <w:sz w:val="26"/>
+          <w:szCs w:val="26"/>
+        </w:rPr>
+        <w:t xml:space="preserve">Hai tâm lý cần khắc phục và định hướng: (1) chưa biết cách khai thác nên cho rằng AI không hiệu quả, không sử dụng – nguyên nhân thường là chọn sai công cụ, giao việc chưa đúng cách, khắc phục bằng phương pháp ở Phần II, III; (2) sử dụng nhưng thiếu trách nhiệm, không kiểm soát – dùng kết quả không kiểm tra, trích dẫn không xác minh, đưa dữ liệu không được phép lên AI, khắc phục bằng nguyên tắc: nhà khoa học kiểm tra, xác nhận và chịu trách nhiệm về kết quả; phân loại dữ liệu trước khi đưa lên AI (Phần IV).</w:t>
       </w:r>
     </w:p>
     <w:p>

</xml_diff>